<commit_message>
feat: add historical features to training pipeline
</commit_message>
<xml_diff>
--- a/docs/model_training_evidence.docx
+++ b/docs/model_training_evidence.docx
@@ -213,6 +213,54 @@
         <w:t>Se guarda metadata completa de entrenamiento en `training_metadata.json`.</w:t>
       </w:r>
     </w:p>
+    <w:p>
+      <w:pPr>
+        <w:pStyle w:val="ListBullet"/>
+      </w:pPr>
+      <w:r>
+        <w:t>Se agregaron features historicas agregadas al pipeline:</w:t>
+      </w:r>
+    </w:p>
+    <w:p>
+      <w:pPr>
+        <w:pStyle w:val="ListBullet"/>
+      </w:pPr>
+      <w:r>
+        <w:t>cantidad de registros por jugador</w:t>
+      </w:r>
+    </w:p>
+    <w:p>
+      <w:pPr>
+        <w:pStyle w:val="ListBullet"/>
+      </w:pPr>
+      <w:r>
+        <w:t>promedio historico de `final_score`</w:t>
+      </w:r>
+    </w:p>
+    <w:p>
+      <w:pPr>
+        <w:pStyle w:val="ListBullet"/>
+      </w:pPr>
+      <w:r>
+        <w:t>promedio historico de `pass_accuracy`</w:t>
+      </w:r>
+    </w:p>
+    <w:p>
+      <w:pPr>
+        <w:pStyle w:val="ListBullet"/>
+      </w:pPr>
+      <w:r>
+        <w:t>ultimo `final_score` registrado</w:t>
+      </w:r>
+    </w:p>
+    <w:p>
+      <w:pPr>
+        <w:pStyle w:val="ListBullet"/>
+      </w:pPr>
+      <w:r>
+        <w:t>La generacion sintetica ahora crea `PlayerStat` para que esas features existan tambien en la base de entrenamiento.</w:t>
+      </w:r>
+    </w:p>
     <w:p/>
     <w:p>
       <w:pPr>
@@ -227,7 +275,7 @@
         <w:pStyle w:val="ListBullet"/>
       </w:pPr>
       <w:r>
-        <w:t>Fecha de corrida registrada: `2026-04-16T23:27:30.345647`</w:t>
+        <w:t>Fecha de corrida registrada: `2026-04-16T23:38:49.493944`</w:t>
       </w:r>
     </w:p>
     <w:p>
@@ -243,7 +291,7 @@
         <w:pStyle w:val="ListBullet"/>
       </w:pPr>
       <w:r>
-        <w:t>Distribucion actual de clases: 4131 positivos y 15869 negativos.</w:t>
+        <w:t>Distribucion actual de clases: 4058 positivos y 15942 negativos.</w:t>
       </w:r>
     </w:p>
     <w:p>
@@ -251,7 +299,7 @@
         <w:pStyle w:val="ListBullet"/>
       </w:pPr>
       <w:r>
-        <w:t>Tasa positiva actual: 20.66%.</w:t>
+        <w:t>Tasa positiva actual: 20.29%.</w:t>
       </w:r>
     </w:p>
     <w:p>
@@ -267,7 +315,7 @@
         <w:pStyle w:val="ListBullet"/>
       </w:pPr>
       <w:r>
-        <w:t>`pos_weight` utilizado: 3.8426.</w:t>
+        <w:t>`pos_weight` utilizado: 3.9296.</w:t>
       </w:r>
     </w:p>
     <w:p>
@@ -275,7 +323,7 @@
         <w:pStyle w:val="ListBullet"/>
       </w:pPr>
       <w:r>
-        <w:t>Early stopping: mejor epoca 12 y threshold elegido 0.525.</w:t>
+        <w:t>Early stopping: mejor epoca 30 y threshold elegido 0.525.</w:t>
       </w:r>
     </w:p>
     <w:p/>
@@ -292,7 +340,7 @@
         <w:pStyle w:val="ListBullet"/>
       </w:pPr>
       <w:r>
-        <w:t>Validacion: accuracy 0.7213, ROC-AUC 0.8078, PR-AUC 0.5436, F1 0.5277, precision 0.4061, recall 0.7532.</w:t>
+        <w:t>Validacion: accuracy 0.8460, ROC-AUC 0.9010, PR-AUC 0.7657, F1 0.6705, precision 0.5927, recall 0.7718.</w:t>
       </w:r>
     </w:p>
     <w:p>
@@ -300,7 +348,7 @@
         <w:pStyle w:val="ListBullet"/>
       </w:pPr>
       <w:r>
-        <w:t>Test: accuracy 0.7177, ROC-AUC 0.7962, PR-AUC 0.5192, F1 0.5217, precision 0.4014, recall 0.7452.</w:t>
+        <w:t>Test: accuracy 0.8557, ROC-AUC 0.9130, PR-AUC 0.7887, F1 0.6905, precision 0.6114, recall 0.7931.</w:t>
       </w:r>
     </w:p>
     <w:p>
@@ -308,7 +356,7 @@
         <w:pStyle w:val="ListBullet"/>
       </w:pPr>
       <w:r>
-        <w:t>Matriz de confusion PyTorch en test: [[1691, 689], [158, 462]].</w:t>
+        <w:t>Matriz de confusion PyTorch en test: [[2084, 307], [126, 483]].</w:t>
       </w:r>
     </w:p>
     <w:p/>
@@ -325,7 +373,7 @@
         <w:pStyle w:val="ListBullet"/>
       </w:pPr>
       <w:r>
-        <w:t>`LogisticRegression(class_weight="balanced")`: accuracy 0.8143, ROC-AUC 0.8452, PR-AUC 0.6019, F1 0.5745, precision 0.5457, recall 0.6065.</w:t>
+        <w:t>`LogisticRegression(class_weight="balanced")`: accuracy 0.9447, ROC-AUC 0.9621, PR-AUC 0.9175, F1 0.8536, precision 0.9219, recall 0.7947.</w:t>
       </w:r>
     </w:p>
     <w:p>
@@ -333,7 +381,7 @@
         <w:pStyle w:val="ListBullet"/>
       </w:pPr>
       <w:r>
-        <w:t>Baseline simple por promedio de atributos: accuracy 0.8010, ROC-AUC 0.8134, PR-AUC 0.5521, F1 0.5332.</w:t>
+        <w:t>Baseline simple por promedio de atributos: accuracy 0.7557, ROC-AUC 0.8088, PR-AUC 0.5515, F1 0.5292.</w:t>
       </w:r>
     </w:p>
     <w:p/>
@@ -358,7 +406,7 @@
         <w:pStyle w:val="ListBullet"/>
       </w:pPr>
       <w:r>
-        <w:t>La MLP actual ya no colapsa a todo negativo: paso de F1 0.0000 a F1 0.5217 y de PR-AUC 0.0915 a PR-AUC 0.5192.</w:t>
+        <w:t>La MLP actual ya no colapsa a todo negativo: paso de F1 0.0000 a F1 0.6905 y de PR-AUC 0.0915 a PR-AUC 0.7887.</w:t>
       </w:r>
     </w:p>
     <w:p>
@@ -366,7 +414,7 @@
         <w:pStyle w:val="ListBullet"/>
       </w:pPr>
       <w:r>
-        <w:t>La alineacion del dataset a 12-18 y la nueva configuracion de entrenamiento mejoraron fuerte la calidad respecto al diagnostico previo.</w:t>
+        <w:t>La alineacion del dataset a 12-18, el entrenamiento endurecido y las features historicas agregadas mejoraron fuerte la calidad respecto al diagnostico previo.</w:t>
       </w:r>
     </w:p>
     <w:p>
@@ -375,6 +423,14 @@
       </w:pPr>
       <w:r>
         <w:t>Aun asi, el baseline `LogisticRegression(class_weight="balanced")` sigue superando a la MLP en ROC-AUC, PR-AUC y F1.</w:t>
+      </w:r>
+    </w:p>
+    <w:p>
+      <w:pPr>
+        <w:pStyle w:val="ListBullet"/>
+      </w:pPr>
+      <w:r>
+        <w:t>El baseline simple por promedio de atributos ya no explica bien el target frente al nuevo pipeline, lo que indica que la etiqueta sintetica quedo menos trivial que antes.</w:t>
       </w:r>
     </w:p>
     <w:p>
@@ -392,14 +448,6 @@
       </w:pPr>
       <w:r>
         <w:t>Limites que todavia no estan resueltos</w:t>
-      </w:r>
-    </w:p>
-    <w:p>
-      <w:pPr>
-        <w:pStyle w:val="ListBullet"/>
-      </w:pPr>
-      <w:r>
-        <w:t>Todavia no se agregaron features historicas agregadas con `pandas`.</w:t>
       </w:r>
     </w:p>
     <w:p>
@@ -440,7 +488,7 @@
         <w:pStyle w:val="ListBullet"/>
       </w:pPr>
       <w:r>
-        <w:t>`pytest -q`: 31 tests aprobados.</w:t>
+        <w:t>`pytest -q`: 33 tests aprobados.</w:t>
       </w:r>
     </w:p>
     <w:p>
@@ -489,6 +537,22 @@
       </w:pPr>
       <w:r>
         <w:t>sensibilidad de la etiqueta sintetica a edad y posicion</w:t>
+      </w:r>
+    </w:p>
+    <w:p>
+      <w:pPr>
+        <w:pStyle w:val="ListBullet"/>
+      </w:pPr>
+      <w:r>
+        <w:t>merge de features historicas en el dataset de entrenamiento</w:t>
+      </w:r>
+    </w:p>
+    <w:p>
+      <w:pPr>
+        <w:pStyle w:val="ListBullet"/>
+      </w:pPr>
+      <w:r>
+        <w:t>inclusion de features historicas en la inferencia de la app</w:t>
       </w:r>
     </w:p>
     <w:p>

</xml_diff>

<commit_message>
feat: add longitudinal attribute history to training
</commit_message>
<xml_diff>
--- a/docs/model_training_evidence.docx
+++ b/docs/model_training_evidence.docx
@@ -261,6 +261,54 @@
         <w:t>La generacion sintetica ahora crea `PlayerStat` para que esas features existan tambien en la base de entrenamiento.</w:t>
       </w:r>
     </w:p>
+    <w:p>
+      <w:pPr>
+        <w:pStyle w:val="ListBullet"/>
+      </w:pPr>
+      <w:r>
+        <w:t>`PlayerAttributeHistory` ahora entra al pipeline con senales longitudinales como:</w:t>
+      </w:r>
+    </w:p>
+    <w:p>
+      <w:pPr>
+        <w:pStyle w:val="ListBullet"/>
+      </w:pPr>
+      <w:r>
+        <w:t>mejora media en 90, 180 y 365 dias</w:t>
+      </w:r>
+    </w:p>
+    <w:p>
+      <w:pPr>
+        <w:pStyle w:val="ListBullet"/>
+      </w:pPr>
+      <w:r>
+        <w:t>pendiente de crecimiento</w:t>
+      </w:r>
+    </w:p>
+    <w:p>
+      <w:pPr>
+        <w:pStyle w:val="ListBullet"/>
+      </w:pPr>
+      <w:r>
+        <w:t>volatilidad del progreso</w:t>
+      </w:r>
+    </w:p>
+    <w:p>
+      <w:pPr>
+        <w:pStyle w:val="ListBullet"/>
+      </w:pPr>
+      <w:r>
+        <w:t>gap entre la ficha actual y la trayectoria reciente</w:t>
+      </w:r>
+    </w:p>
+    <w:p>
+      <w:pPr>
+        <w:pStyle w:val="ListBullet"/>
+      </w:pPr>
+      <w:r>
+        <w:t>La generacion sintetica ahora crea entre 6 y 12 snapshots tecnicos por jugador y deriva `PlayerStat` desde esa evolucion.</w:t>
+      </w:r>
+    </w:p>
     <w:p/>
     <w:p>
       <w:pPr>
@@ -275,7 +323,7 @@
         <w:pStyle w:val="ListBullet"/>
       </w:pPr>
       <w:r>
-        <w:t>Fecha de corrida registrada: `2026-04-16T23:38:49.493944`</w:t>
+        <w:t>Fecha de corrida registrada: `2026-04-17T23:06:50.198032`</w:t>
       </w:r>
     </w:p>
     <w:p>
@@ -291,7 +339,7 @@
         <w:pStyle w:val="ListBullet"/>
       </w:pPr>
       <w:r>
-        <w:t>Distribucion actual de clases: 4058 positivos y 15942 negativos.</w:t>
+        <w:t>Distribucion actual de clases: 3988 positivos y 16012 negativos.</w:t>
       </w:r>
     </w:p>
     <w:p>
@@ -299,7 +347,7 @@
         <w:pStyle w:val="ListBullet"/>
       </w:pPr>
       <w:r>
-        <w:t>Tasa positiva actual: 20.29%.</w:t>
+        <w:t>Tasa positiva actual: 19.94%.</w:t>
       </w:r>
     </w:p>
     <w:p>
@@ -315,7 +363,7 @@
         <w:pStyle w:val="ListBullet"/>
       </w:pPr>
       <w:r>
-        <w:t>`pos_weight` utilizado: 3.9296.</w:t>
+        <w:t>`pos_weight` utilizado: 4.0143.</w:t>
       </w:r>
     </w:p>
     <w:p>
@@ -323,7 +371,7 @@
         <w:pStyle w:val="ListBullet"/>
       </w:pPr>
       <w:r>
-        <w:t>Early stopping: mejor epoca 30 y threshold elegido 0.525.</w:t>
+        <w:t>Early stopping: mejor epoca 30 y threshold elegido 0.550.</w:t>
       </w:r>
     </w:p>
     <w:p/>
@@ -340,7 +388,7 @@
         <w:pStyle w:val="ListBullet"/>
       </w:pPr>
       <w:r>
-        <w:t>Validacion: accuracy 0.8460, ROC-AUC 0.9010, PR-AUC 0.7657, F1 0.6705, precision 0.5927, recall 0.7718.</w:t>
+        <w:t>Validacion: accuracy 0.8283, ROC-AUC 0.8390, PR-AUC 0.5955, F1 0.5712, precision 0.5688, recall 0.5736.</w:t>
       </w:r>
     </w:p>
     <w:p>
@@ -348,7 +396,7 @@
         <w:pStyle w:val="ListBullet"/>
       </w:pPr>
       <w:r>
-        <w:t>Test: accuracy 0.8557, ROC-AUC 0.9130, PR-AUC 0.7887, F1 0.6905, precision 0.6114, recall 0.7931.</w:t>
+        <w:t>Test: accuracy 0.8360, ROC-AUC 0.8468, PR-AUC 0.6153, F1 0.5751, precision 0.5946, recall 0.5569.</w:t>
       </w:r>
     </w:p>
     <w:p>
@@ -356,7 +404,7 @@
         <w:pStyle w:val="ListBullet"/>
       </w:pPr>
       <w:r>
-        <w:t>Matriz de confusion PyTorch en test: [[2084, 307], [126, 483]].</w:t>
+        <w:t>Matriz de confusion PyTorch en test: [[2175, 227], [265, 333]].</w:t>
       </w:r>
     </w:p>
     <w:p/>
@@ -373,7 +421,7 @@
         <w:pStyle w:val="ListBullet"/>
       </w:pPr>
       <w:r>
-        <w:t>`LogisticRegression(class_weight="balanced")`: accuracy 0.9447, ROC-AUC 0.9621, PR-AUC 0.9175, F1 0.8536, precision 0.9219, recall 0.7947.</w:t>
+        <w:t>`LogisticRegression(class_weight="balanced")`: accuracy 0.8687, ROC-AUC 0.9052, PR-AUC 0.7360, F1 0.6878, precision 0.6536, recall 0.7258.</w:t>
       </w:r>
     </w:p>
     <w:p>
@@ -381,7 +429,7 @@
         <w:pStyle w:val="ListBullet"/>
       </w:pPr>
       <w:r>
-        <w:t>Baseline simple por promedio de atributos: accuracy 0.7557, ROC-AUC 0.8088, PR-AUC 0.5515, F1 0.5292.</w:t>
+        <w:t>Baseline simple por promedio de atributos: accuracy 0.8010, ROC-AUC 0.8206, PR-AUC 0.5483, F1 0.5383.</w:t>
       </w:r>
     </w:p>
     <w:p/>
@@ -406,7 +454,7 @@
         <w:pStyle w:val="ListBullet"/>
       </w:pPr>
       <w:r>
-        <w:t>La MLP actual ya no colapsa a todo negativo: paso de F1 0.0000 a F1 0.6905 y de PR-AUC 0.0915 a PR-AUC 0.7887.</w:t>
+        <w:t>La MLP actual ya no colapsa a todo negativo: paso de F1 0.0000 a F1 0.5751 y de PR-AUC 0.0915 a PR-AUC 0.6153.</w:t>
       </w:r>
     </w:p>
     <w:p>
@@ -414,7 +462,15 @@
         <w:pStyle w:val="ListBullet"/>
       </w:pPr>
       <w:r>
-        <w:t>La alineacion del dataset a 12-18, el entrenamiento endurecido y las features historicas agregadas mejoraron fuerte la calidad respecto al diagnostico previo.</w:t>
+        <w:t>El entrenamiento ya no usa solo foto fija: aprende con rendimiento historico y con evolucion tecnica de `PlayerAttributeHistory`.</w:t>
+      </w:r>
+    </w:p>
+    <w:p>
+      <w:pPr>
+        <w:pStyle w:val="ListBullet"/>
+      </w:pPr>
+      <w:r>
+        <w:t>La alineacion del dataset a 12-18, el entrenamiento endurecido y las features longitudinales mejoraron fuerte la defendibilidad metodologica respecto al diagnostico previo.</w:t>
       </w:r>
     </w:p>
     <w:p>
@@ -448,6 +504,30 @@
       </w:pPr>
       <w:r>
         <w:t>Limites que todavia no estan resueltos</w:t>
+      </w:r>
+    </w:p>
+    <w:p>
+      <w:pPr>
+        <w:pStyle w:val="ListBullet"/>
+      </w:pPr>
+      <w:r>
+        <w:t>Todavia falta contexto de partido explicito (`Match` y participacion del jugador por partido).</w:t>
+      </w:r>
+    </w:p>
+    <w:p>
+      <w:pPr>
+        <w:pStyle w:val="ListBullet"/>
+      </w:pPr>
+      <w:r>
+        <w:t>Todavia no hay reportes cualitativos de scout en la base de entrenamiento.</w:t>
+      </w:r>
+    </w:p>
+    <w:p>
+      <w:pPr>
+        <w:pStyle w:val="ListBullet"/>
+      </w:pPr>
+      <w:r>
+        <w:t>El target sigue siendo `potential_label` binario y no una meta temporal de progresion.</w:t>
       </w:r>
     </w:p>
     <w:p>
@@ -553,6 +633,14 @@
       </w:pPr>
       <w:r>
         <w:t>inclusion de features historicas en la inferencia de la app</w:t>
+      </w:r>
+    </w:p>
+    <w:p>
+      <w:pPr>
+        <w:pStyle w:val="ListBullet"/>
+      </w:pPr>
+      <w:r>
+        <w:t>features longitudinales de `PlayerAttributeHistory`</w:t>
       </w:r>
     </w:p>
     <w:p>

</xml_diff>

<commit_message>
feat: add match context and scout reports to training
</commit_message>
<xml_diff>
--- a/docs/model_training_evidence.docx
+++ b/docs/model_training_evidence.docx
@@ -309,6 +309,94 @@
         <w:t>La generacion sintetica ahora crea entre 6 y 12 snapshots tecnicos por jugador y deriva `PlayerStat` desde esa evolucion.</w:t>
       </w:r>
     </w:p>
+    <w:p>
+      <w:pPr>
+        <w:pStyle w:val="ListBullet"/>
+      </w:pPr>
+      <w:r>
+        <w:t>Se agrego contexto minimo de partido con `Match` y `PlayerMatchParticipation`.</w:t>
+      </w:r>
+    </w:p>
+    <w:p>
+      <w:pPr>
+        <w:pStyle w:val="ListBullet"/>
+      </w:pPr>
+      <w:r>
+        <w:t>El pipeline ahora agrega senales de partido como:</w:t>
+      </w:r>
+    </w:p>
+    <w:p>
+      <w:pPr>
+        <w:pStyle w:val="ListBullet"/>
+      </w:pPr>
+      <w:r>
+        <w:t>cantidad de participaciones</w:t>
+      </w:r>
+    </w:p>
+    <w:p>
+      <w:pPr>
+        <w:pStyle w:val="ListBullet"/>
+      </w:pPr>
+      <w:r>
+        <w:t>minutos medios</w:t>
+      </w:r>
+    </w:p>
+    <w:p>
+      <w:pPr>
+        <w:pStyle w:val="ListBullet"/>
+      </w:pPr>
+      <w:r>
+        <w:t>tasa de titularidad</w:t>
+      </w:r>
+    </w:p>
+    <w:p>
+      <w:pPr>
+        <w:pStyle w:val="ListBullet"/>
+      </w:pPr>
+      <w:r>
+        <w:t>nivel medio del rival</w:t>
+      </w:r>
+    </w:p>
+    <w:p>
+      <w:pPr>
+        <w:pStyle w:val="ListBullet"/>
+      </w:pPr>
+      <w:r>
+        <w:t>porcentaje de partidos en posicion natural</w:t>
+      </w:r>
+    </w:p>
+    <w:p>
+      <w:pPr>
+        <w:pStyle w:val="ListBullet"/>
+      </w:pPr>
+      <w:r>
+        <w:t>Se agregaron `ScoutReport` sinteticos y el pipeline agrega:</w:t>
+      </w:r>
+    </w:p>
+    <w:p>
+      <w:pPr>
+        <w:pStyle w:val="ListBullet"/>
+      </w:pPr>
+      <w:r>
+        <w:t>cantidad de reportes</w:t>
+      </w:r>
+    </w:p>
+    <w:p>
+      <w:pPr>
+        <w:pStyle w:val="ListBullet"/>
+      </w:pPr>
+      <w:r>
+        <w:t>medias de toma de decisiones, lectura tactica, perfil mental y adaptabilidad</w:t>
+      </w:r>
+    </w:p>
+    <w:p>
+      <w:pPr>
+        <w:pStyle w:val="ListBullet"/>
+      </w:pPr>
+      <w:r>
+        <w:t>ultima proyeccion observada por scout</w:t>
+      </w:r>
+    </w:p>
     <w:p/>
     <w:p>
       <w:pPr>
@@ -323,7 +411,7 @@
         <w:pStyle w:val="ListBullet"/>
       </w:pPr>
       <w:r>
-        <w:t>Fecha de corrida registrada: `2026-04-17T23:06:50.198032`</w:t>
+        <w:t>Fecha de corrida registrada: `2026-04-17T23:30:13.218252`</w:t>
       </w:r>
     </w:p>
     <w:p>
@@ -339,7 +427,7 @@
         <w:pStyle w:val="ListBullet"/>
       </w:pPr>
       <w:r>
-        <w:t>Distribucion actual de clases: 3988 positivos y 16012 negativos.</w:t>
+        <w:t>Distribucion actual de clases: 4091 positivos y 15909 negativos.</w:t>
       </w:r>
     </w:p>
     <w:p>
@@ -347,7 +435,7 @@
         <w:pStyle w:val="ListBullet"/>
       </w:pPr>
       <w:r>
-        <w:t>Tasa positiva actual: 19.94%.</w:t>
+        <w:t>Tasa positiva actual: 20.46%.</w:t>
       </w:r>
     </w:p>
     <w:p>
@@ -363,7 +451,7 @@
         <w:pStyle w:val="ListBullet"/>
       </w:pPr>
       <w:r>
-        <w:t>`pos_weight` utilizado: 4.0143.</w:t>
+        <w:t>`pos_weight` utilizado: 3.8900.</w:t>
       </w:r>
     </w:p>
     <w:p>
@@ -388,7 +476,7 @@
         <w:pStyle w:val="ListBullet"/>
       </w:pPr>
       <w:r>
-        <w:t>Validacion: accuracy 0.8283, ROC-AUC 0.8390, PR-AUC 0.5955, F1 0.5712, precision 0.5688, recall 0.5736.</w:t>
+        <w:t>Validacion: accuracy 0.8517, ROC-AUC 0.8798, PR-AUC 0.6854, F1 0.6331, precision 0.6411, recall 0.6254.</w:t>
       </w:r>
     </w:p>
     <w:p>
@@ -396,7 +484,7 @@
         <w:pStyle w:val="ListBullet"/>
       </w:pPr>
       <w:r>
-        <w:t>Test: accuracy 0.8360, ROC-AUC 0.8468, PR-AUC 0.6153, F1 0.5751, precision 0.5946, recall 0.5569.</w:t>
+        <w:t>Test: accuracy 0.8380, ROC-AUC 0.8628, PR-AUC 0.6508, F1 0.6042, precision 0.6042, recall 0.6042.</w:t>
       </w:r>
     </w:p>
     <w:p>
@@ -404,7 +492,7 @@
         <w:pStyle w:val="ListBullet"/>
       </w:pPr>
       <w:r>
-        <w:t>Matriz de confusion PyTorch en test: [[2175, 227], [265, 333]].</w:t>
+        <w:t>Matriz de confusion PyTorch en test: [[2143, 243], [243, 371]].</w:t>
       </w:r>
     </w:p>
     <w:p/>
@@ -421,7 +509,7 @@
         <w:pStyle w:val="ListBullet"/>
       </w:pPr>
       <w:r>
-        <w:t>`LogisticRegression(class_weight="balanced")`: accuracy 0.8687, ROC-AUC 0.9052, PR-AUC 0.7360, F1 0.6878, precision 0.6536, recall 0.7258.</w:t>
+        <w:t>`LogisticRegression(class_weight="balanced")`: accuracy 0.8600, ROC-AUC 0.8996, PR-AUC 0.7373, F1 0.6769, precision 0.6414, recall 0.7166.</w:t>
       </w:r>
     </w:p>
     <w:p>
@@ -429,7 +517,7 @@
         <w:pStyle w:val="ListBullet"/>
       </w:pPr>
       <w:r>
-        <w:t>Baseline simple por promedio de atributos: accuracy 0.8010, ROC-AUC 0.8206, PR-AUC 0.5483, F1 0.5383.</w:t>
+        <w:t>Baseline simple por promedio de atributos: accuracy 0.7777, ROC-AUC 0.8278, PR-AUC 0.5840, F1 0.5592.</w:t>
       </w:r>
     </w:p>
     <w:p/>
@@ -454,7 +542,7 @@
         <w:pStyle w:val="ListBullet"/>
       </w:pPr>
       <w:r>
-        <w:t>La MLP actual ya no colapsa a todo negativo: paso de F1 0.0000 a F1 0.5751 y de PR-AUC 0.0915 a PR-AUC 0.6153.</w:t>
+        <w:t>La MLP actual ya no colapsa a todo negativo: paso de F1 0.0000 a F1 0.6042 y de PR-AUC 0.0915 a PR-AUC 0.6508.</w:t>
       </w:r>
     </w:p>
     <w:p>
@@ -463,6 +551,14 @@
       </w:pPr>
       <w:r>
         <w:t>El entrenamiento ya no usa solo foto fija: aprende con rendimiento historico y con evolucion tecnica de `PlayerAttributeHistory`.</w:t>
+      </w:r>
+    </w:p>
+    <w:p>
+      <w:pPr>
+        <w:pStyle w:val="ListBullet"/>
+      </w:pPr>
+      <w:r>
+        <w:t>El entrenamiento ahora tambien incorpora contexto de partido y senal cualitativa sintetica del scout.</w:t>
       </w:r>
     </w:p>
     <w:p>
@@ -511,7 +607,7 @@
         <w:pStyle w:val="ListBullet"/>
       </w:pPr>
       <w:r>
-        <w:t>Todavia falta contexto de partido explicito (`Match` y participacion del jugador por partido).</w:t>
+        <w:t>Los partidos sinteticos todavia no representan encuentros compartidos entre varios jugadores del mismo plantel.</w:t>
       </w:r>
     </w:p>
     <w:p>
@@ -519,7 +615,7 @@
         <w:pStyle w:val="ListBullet"/>
       </w:pPr>
       <w:r>
-        <w:t>Todavia no hay reportes cualitativos de scout en la base de entrenamiento.</w:t>
+        <w:t>Los `ScoutReport` actuales siguen siendo sinteticos, no manuales ni cargados por usuarios reales.</w:t>
       </w:r>
     </w:p>
     <w:p>

</xml_diff>

<commit_message>
feat: train on temporal progression targets
</commit_message>
<xml_diff>
--- a/docs/model_training_evidence.docx
+++ b/docs/model_training_evidence.docx
@@ -397,6 +397,46 @@
         <w:t>ultima proyeccion observada por scout</w:t>
       </w:r>
     </w:p>
+    <w:p>
+      <w:pPr>
+        <w:pStyle w:val="ListBullet"/>
+      </w:pPr>
+      <w:r>
+        <w:t>El entrenamiento ya no usa `potential_label` como target principal.</w:t>
+      </w:r>
+    </w:p>
+    <w:p>
+      <w:pPr>
+        <w:pStyle w:val="ListBullet"/>
+      </w:pPr>
+      <w:r>
+        <w:t>Ahora el target es `temporal_target_label`, derivado de un corte observado/futuro por jugador:</w:t>
+      </w:r>
+    </w:p>
+    <w:p>
+      <w:pPr>
+        <w:pStyle w:val="ListBullet"/>
+      </w:pPr>
+      <w:r>
+        <w:t>las features se construyen sobre la parte observada de la trayectoria</w:t>
+      </w:r>
+    </w:p>
+    <w:p>
+      <w:pPr>
+        <w:pStyle w:val="ListBullet"/>
+      </w:pPr>
+      <w:r>
+        <w:t>el target se marca positivo cuando el tramo futuro muestra crecimiento tecnico y mejora o consolidacion de rendimiento</w:t>
+      </w:r>
+    </w:p>
+    <w:p>
+      <w:pPr>
+        <w:pStyle w:val="ListBullet"/>
+      </w:pPr>
+      <w:r>
+        <w:t>el dataset temporal usa atributos anclados en el punto de corte para evitar fuga de informacion desde el estado final del jugador</w:t>
+      </w:r>
+    </w:p>
     <w:p/>
     <w:p>
       <w:pPr>
@@ -411,7 +451,7 @@
         <w:pStyle w:val="ListBullet"/>
       </w:pPr>
       <w:r>
-        <w:t>Fecha de corrida registrada: `2026-04-17T23:30:13.218252`</w:t>
+        <w:t>Fecha de corrida registrada: `2026-04-18T00:10:13.257885`</w:t>
       </w:r>
     </w:p>
     <w:p>
@@ -419,7 +459,7 @@
         <w:pStyle w:val="ListBullet"/>
       </w:pPr>
       <w:r>
-        <w:t>Dataset actual: 20000 jugadores dentro del rango 12-18.</w:t>
+        <w:t>Dataset actual: 20000 jugadores dentro del rango 12-17.</w:t>
       </w:r>
     </w:p>
     <w:p>
@@ -427,7 +467,7 @@
         <w:pStyle w:val="ListBullet"/>
       </w:pPr>
       <w:r>
-        <w:t>Distribucion actual de clases: 4091 positivos y 15909 negativos.</w:t>
+        <w:t>Distribucion actual de clases: 988 positivos y 19012 negativos.</w:t>
       </w:r>
     </w:p>
     <w:p>
@@ -435,7 +475,7 @@
         <w:pStyle w:val="ListBullet"/>
       </w:pPr>
       <w:r>
-        <w:t>Tasa positiva actual: 20.46%.</w:t>
+        <w:t>Tasa positiva actual: 4.94%.</w:t>
       </w:r>
     </w:p>
     <w:p>
@@ -451,7 +491,7 @@
         <w:pStyle w:val="ListBullet"/>
       </w:pPr>
       <w:r>
-        <w:t>`pos_weight` utilizado: 3.8900.</w:t>
+        <w:t>`pos_weight` utilizado: 19.2312.</w:t>
       </w:r>
     </w:p>
     <w:p>
@@ -459,7 +499,7 @@
         <w:pStyle w:val="ListBullet"/>
       </w:pPr>
       <w:r>
-        <w:t>Early stopping: mejor epoca 30 y threshold elegido 0.550.</w:t>
+        <w:t>Early stopping: mejor epoca 30 y threshold elegido 0.525.</w:t>
       </w:r>
     </w:p>
     <w:p/>
@@ -476,7 +516,7 @@
         <w:pStyle w:val="ListBullet"/>
       </w:pPr>
       <w:r>
-        <w:t>Validacion: accuracy 0.8517, ROC-AUC 0.8798, PR-AUC 0.6854, F1 0.6331, precision 0.6411, recall 0.6254.</w:t>
+        <w:t>Validacion: accuracy 0.8637, ROC-AUC 0.8353, PR-AUC 0.2018, F1 0.2735, precision 0.1855, recall 0.5203.</w:t>
       </w:r>
     </w:p>
     <w:p>
@@ -484,7 +524,7 @@
         <w:pStyle w:val="ListBullet"/>
       </w:pPr>
       <w:r>
-        <w:t>Test: accuracy 0.8380, ROC-AUC 0.8628, PR-AUC 0.6508, F1 0.6042, precision 0.6042, recall 0.6042.</w:t>
+        <w:t>Test: accuracy 0.8680, ROC-AUC 0.8374, PR-AUC 0.2598, F1 0.2528, precision 0.1754, recall 0.4527.</w:t>
       </w:r>
     </w:p>
     <w:p>
@@ -492,7 +532,7 @@
         <w:pStyle w:val="ListBullet"/>
       </w:pPr>
       <w:r>
-        <w:t>Matriz de confusion PyTorch en test: [[2143, 243], [243, 371]].</w:t>
+        <w:t>Matriz de confusion PyTorch en test: [[2537, 315], [81, 67]].</w:t>
       </w:r>
     </w:p>
     <w:p/>
@@ -509,7 +549,7 @@
         <w:pStyle w:val="ListBullet"/>
       </w:pPr>
       <w:r>
-        <w:t>`LogisticRegression(class_weight="balanced")`: accuracy 0.8600, ROC-AUC 0.8996, PR-AUC 0.7373, F1 0.6769, precision 0.6414, recall 0.7166.</w:t>
+        <w:t>`LogisticRegression(class_weight="balanced")`: accuracy 0.9380, ROC-AUC 0.9279, PR-AUC 0.3645, F1 0.3922, precision 0.3797, recall 0.4054.</w:t>
       </w:r>
     </w:p>
     <w:p>
@@ -517,7 +557,7 @@
         <w:pStyle w:val="ListBullet"/>
       </w:pPr>
       <w:r>
-        <w:t>Baseline simple por promedio de atributos: accuracy 0.7777, ROC-AUC 0.8278, PR-AUC 0.5840, F1 0.5592.</w:t>
+        <w:t>Baseline simple por promedio de atributos: accuracy 0.1037, ROC-AUC 0.4094, PR-AUC 0.0389, F1 0.0906.</w:t>
       </w:r>
     </w:p>
     <w:p/>
@@ -542,7 +582,7 @@
         <w:pStyle w:val="ListBullet"/>
       </w:pPr>
       <w:r>
-        <w:t>La MLP actual ya no colapsa a todo negativo: paso de F1 0.0000 a F1 0.6042 y de PR-AUC 0.0915 a PR-AUC 0.6508.</w:t>
+        <w:t>La MLP actual ya no colapsa a todo negativo: paso de F1 0.0000 a F1 0.2528 y de PR-AUC 0.0915 a PR-AUC 0.2598.</w:t>
       </w:r>
     </w:p>
     <w:p>
@@ -559,6 +599,22 @@
       </w:pPr>
       <w:r>
         <w:t>El entrenamiento ahora tambien incorpora contexto de partido y senal cualitativa sintetica del scout.</w:t>
+      </w:r>
+    </w:p>
+    <w:p>
+      <w:pPr>
+        <w:pStyle w:val="ListBullet"/>
+      </w:pPr>
+      <w:r>
+        <w:t>El problema de entrenamiento ahora es metodologicamente mas realista porque el target representa progresion futura y no un booleano estatico sintetico.</w:t>
+      </w:r>
+    </w:p>
+    <w:p>
+      <w:pPr>
+        <w:pStyle w:val="ListBullet"/>
+      </w:pPr>
+      <w:r>
+        <w:t>El cambio de target volvio el problema mucho mas desbalanceado y exigente: la tasa positiva actual es 4.94%.</w:t>
       </w:r>
     </w:p>
     <w:p>
@@ -623,7 +679,7 @@
         <w:pStyle w:val="ListBullet"/>
       </w:pPr>
       <w:r>
-        <w:t>El target sigue siendo `potential_label` binario y no una meta temporal de progresion.</w:t>
+        <w:t>Aunque el target ya es temporal, sus umbrales todavia son sinteticos y pueden requerir recalibracion.</w:t>
       </w:r>
     </w:p>
     <w:p>

</xml_diff>

<commit_message>
feat: recalibrate temporal target and probability pipeline
</commit_message>
<xml_diff>
--- a/docs/model_training_evidence.docx
+++ b/docs/model_training_evidence.docx
@@ -48,6 +48,14 @@
         <w:pStyle w:val="ListBullet"/>
       </w:pPr>
       <w:r>
+        <w:t>Artefacto adicional actual: `probability_calibrator.joblib`.</w:t>
+      </w:r>
+    </w:p>
+    <w:p>
+      <w:pPr>
+        <w:pStyle w:val="ListBullet"/>
+      </w:pPr>
+      <w:r>
         <w:t>El objetivo del producto se mantiene acotado a scouting juvenil de 12 a 18 anos para clubes formativos.</w:t>
       </w:r>
     </w:p>
@@ -170,6 +178,14 @@
         <w:pStyle w:val="ListBullet"/>
       </w:pPr>
       <w:r>
+        <w:t>Se agrego muestreo balanceado por mini-batch con `WeightedRandomSampler`.</w:t>
+      </w:r>
+    </w:p>
+    <w:p>
+      <w:pPr>
+        <w:pStyle w:val="ListBullet"/>
+      </w:pPr>
+      <w:r>
         <w:t>Se cambio el split a `train / validation / test` con seleccion del threshold en validacion.</w:t>
       </w:r>
     </w:p>
@@ -186,6 +202,22 @@
         <w:pStyle w:val="ListBullet"/>
       </w:pPr>
       <w:r>
+        <w:t>Se incorporo calibracion de probabilidades con seleccion automatica entre `none`, `isotonic` y `platt`.</w:t>
+      </w:r>
+    </w:p>
+    <w:p>
+      <w:pPr>
+        <w:pStyle w:val="ListBullet"/>
+      </w:pPr>
+      <w:r>
+        <w:t>Se adopto `AdamW` como optimizador base.</w:t>
+      </w:r>
+    </w:p>
+    <w:p>
+      <w:pPr>
+        <w:pStyle w:val="ListBullet"/>
+      </w:pPr>
+      <w:r>
         <w:t>El entrenamiento ahora se alinea por defecto al alcance real del MVP: edades 12-18.</w:t>
       </w:r>
     </w:p>
@@ -426,7 +458,7 @@
         <w:pStyle w:val="ListBullet"/>
       </w:pPr>
       <w:r>
-        <w:t>el target se marca positivo cuando el tramo futuro muestra crecimiento tecnico y mejora o consolidacion de rendimiento</w:t>
+        <w:t>el target se recalibra con umbrales explicitos de progresion y rendimiento futuro</w:t>
       </w:r>
     </w:p>
     <w:p>
@@ -434,7 +466,23 @@
         <w:pStyle w:val="ListBullet"/>
       </w:pPr>
       <w:r>
+        <w:t>el target positivo ahora admite dos caminos: consolidacion y breakout</w:t>
+      </w:r>
+    </w:p>
+    <w:p>
+      <w:pPr>
+        <w:pStyle w:val="ListBullet"/>
+      </w:pPr>
+      <w:r>
         <w:t>el dataset temporal usa atributos anclados en el punto de corte para evitar fuga de informacion desde el estado final del jugador</w:t>
+      </w:r>
+    </w:p>
+    <w:p>
+      <w:pPr>
+        <w:pStyle w:val="ListBullet"/>
+      </w:pPr>
+      <w:r>
+        <w:t>`generate_data.py` ahora admite `--reset` para regenerar la base sintetica de entrenamiento desde cero de forma reproducible</w:t>
       </w:r>
     </w:p>
     <w:p/>
@@ -451,7 +499,7 @@
         <w:pStyle w:val="ListBullet"/>
       </w:pPr>
       <w:r>
-        <w:t>Fecha de corrida registrada: `2026-04-18T00:10:13.257885`</w:t>
+        <w:t>Fecha de corrida registrada: `2026-04-18T03:05:47.143763`</w:t>
       </w:r>
     </w:p>
     <w:p>
@@ -467,7 +515,7 @@
         <w:pStyle w:val="ListBullet"/>
       </w:pPr>
       <w:r>
-        <w:t>Distribucion actual de clases: 988 positivos y 19012 negativos.</w:t>
+        <w:t>Distribucion actual de clases: 599 positivos y 19401 negativos.</w:t>
       </w:r>
     </w:p>
     <w:p>
@@ -475,7 +523,7 @@
         <w:pStyle w:val="ListBullet"/>
       </w:pPr>
       <w:r>
-        <w:t>Tasa positiva actual: 4.94%.</w:t>
+        <w:t>Tasa positiva actual: 3.00%.</w:t>
       </w:r>
     </w:p>
     <w:p>
@@ -491,7 +539,7 @@
         <w:pStyle w:val="ListBullet"/>
       </w:pPr>
       <w:r>
-        <w:t>`pos_weight` utilizado: 19.2312.</w:t>
+        <w:t>`pos_weight` utilizado: 5.6932.</w:t>
       </w:r>
     </w:p>
     <w:p>
@@ -499,7 +547,47 @@
         <w:pStyle w:val="ListBullet"/>
       </w:pPr>
       <w:r>
-        <w:t>Early stopping: mejor epoca 30 y threshold elegido 0.525.</w:t>
+        <w:t>Early stopping: mejor epoca 1 y threshold elegido 0.175.</w:t>
+      </w:r>
+    </w:p>
+    <w:p>
+      <w:pPr>
+        <w:pStyle w:val="ListBullet"/>
+      </w:pPr>
+      <w:r>
+        <w:t>Metodo de calibracion seleccionado: `isotonic`.</w:t>
+      </w:r>
+    </w:p>
+    <w:p>
+      <w:pPr>
+        <w:pStyle w:val="ListBullet"/>
+      </w:pPr>
+      <w:r>
+        <w:t>Threshold de progresion del target: 0.4051.</w:t>
+      </w:r>
+    </w:p>
+    <w:p>
+      <w:pPr>
+        <w:pStyle w:val="ListBullet"/>
+      </w:pPr>
+      <w:r>
+        <w:t>Threshold de rendimiento futuro del target: 5.2500.</w:t>
+      </w:r>
+    </w:p>
+    <w:p>
+      <w:pPr>
+        <w:pStyle w:val="ListBullet"/>
+      </w:pPr>
+      <w:r>
+        <w:t>Casos positivos por via de consolidacion: 542.</w:t>
+      </w:r>
+    </w:p>
+    <w:p>
+      <w:pPr>
+        <w:pStyle w:val="ListBullet"/>
+      </w:pPr>
+      <w:r>
+        <w:t>Casos positivos por via de breakout: 66.</w:t>
       </w:r>
     </w:p>
     <w:p/>
@@ -516,7 +604,7 @@
         <w:pStyle w:val="ListBullet"/>
       </w:pPr>
       <w:r>
-        <w:t>Validacion: accuracy 0.8637, ROC-AUC 0.8353, PR-AUC 0.2018, F1 0.2735, precision 0.1855, recall 0.5203.</w:t>
+        <w:t>Validacion: accuracy 0.9570, ROC-AUC 0.9543, PR-AUC 0.3558, F1 0.4317, precision 0.3577, recall 0.5444.</w:t>
       </w:r>
     </w:p>
     <w:p>
@@ -524,7 +612,7 @@
         <w:pStyle w:val="ListBullet"/>
       </w:pPr>
       <w:r>
-        <w:t>Test: accuracy 0.8680, ROC-AUC 0.8374, PR-AUC 0.2598, F1 0.2528, precision 0.1754, recall 0.4527.</w:t>
+        <w:t>Test: accuracy 0.9600, ROC-AUC 0.9247, PR-AUC 0.3279, F1 0.4231, precision 0.3729, recall 0.4889.</w:t>
       </w:r>
     </w:p>
     <w:p>
@@ -532,7 +620,7 @@
         <w:pStyle w:val="ListBullet"/>
       </w:pPr>
       <w:r>
-        <w:t>Matriz de confusion PyTorch en test: [[2537, 315], [81, 67]].</w:t>
+        <w:t>Matriz de confusion PyTorch en test: [[2836, 74], [46, 44]].</w:t>
       </w:r>
     </w:p>
     <w:p/>
@@ -549,7 +637,7 @@
         <w:pStyle w:val="ListBullet"/>
       </w:pPr>
       <w:r>
-        <w:t>`LogisticRegression(class_weight="balanced")`: accuracy 0.9380, ROC-AUC 0.9279, PR-AUC 0.3645, F1 0.3922, precision 0.3797, recall 0.4054.</w:t>
+        <w:t>`LogisticRegression(class_weight="balanced")`: accuracy 0.9527, ROC-AUC 0.9431, PR-AUC 0.3923, F1 0.4409, precision 0.3415, recall 0.6222.</w:t>
       </w:r>
     </w:p>
     <w:p>
@@ -557,7 +645,7 @@
         <w:pStyle w:val="ListBullet"/>
       </w:pPr>
       <w:r>
-        <w:t>Baseline simple por promedio de atributos: accuracy 0.1037, ROC-AUC 0.4094, PR-AUC 0.0389, F1 0.0906.</w:t>
+        <w:t>Baseline simple por promedio de atributos: accuracy 0.9547, ROC-AUC 0.9137, PR-AUC 0.2876, F1 0.3061.</w:t>
       </w:r>
     </w:p>
     <w:p/>
@@ -582,7 +670,7 @@
         <w:pStyle w:val="ListBullet"/>
       </w:pPr>
       <w:r>
-        <w:t>La MLP actual ya no colapsa a todo negativo: paso de F1 0.0000 a F1 0.2528 y de PR-AUC 0.0915 a PR-AUC 0.2598.</w:t>
+        <w:t>La MLP actual ya no colapsa a todo negativo: paso de F1 0.0000 a F1 0.4231 y de PR-AUC 0.0915 a PR-AUC 0.3279.</w:t>
       </w:r>
     </w:p>
     <w:p>
@@ -614,7 +702,23 @@
         <w:pStyle w:val="ListBullet"/>
       </w:pPr>
       <w:r>
-        <w:t>El cambio de target volvio el problema mucho mas desbalanceado y exigente: la tasa positiva actual es 4.94%.</w:t>
+        <w:t>El target temporal ya no depende de una sola puerta monotona: mezcla consolidacion y breakout con umbrales explicitados en metadata.</w:t>
+      </w:r>
+    </w:p>
+    <w:p>
+      <w:pPr>
+        <w:pStyle w:val="ListBullet"/>
+      </w:pPr>
+      <w:r>
+        <w:t>La calibracion de probabilidades si quedo implementada y en la corrida actual el metodo elegido fue `isotonic`.</w:t>
+      </w:r>
+    </w:p>
+    <w:p>
+      <w:pPr>
+        <w:pStyle w:val="ListBullet"/>
+      </w:pPr>
+      <w:r>
+        <w:t>El cambio de target mantiene un problema exigente y todavia desbalanceado: la tasa positiva actual es 3.00%.</w:t>
       </w:r>
     </w:p>
     <w:p>
@@ -679,7 +783,7 @@
         <w:pStyle w:val="ListBullet"/>
       </w:pPr>
       <w:r>
-        <w:t>Aunque el target ya es temporal, sus umbrales todavia son sinteticos y pueden requerir recalibracion.</w:t>
+        <w:t>Aunque el target ya es temporal y esta mejor calibrado, sus umbrales siguen siendo sinteticos y pueden requerir otro ajuste.</w:t>
       </w:r>
     </w:p>
     <w:p>
@@ -687,7 +791,7 @@
         <w:pStyle w:val="ListBullet"/>
       </w:pPr>
       <w:r>
-        <w:t>No se implemento calibracion de probabilidades.</w:t>
+        <w:t>La calibracion de probabilidades existe, pero por ahora no alcanza para que PyTorch supere al baseline lineal.</w:t>
       </w:r>
     </w:p>
     <w:p>
@@ -720,7 +824,7 @@
         <w:pStyle w:val="ListBullet"/>
       </w:pPr>
       <w:r>
-        <w:t>`pytest -q`: 33 tests aprobados.</w:t>
+        <w:t>`pytest -q`: 35 tests aprobados.</w:t>
       </w:r>
     </w:p>
     <w:p>
@@ -825,7 +929,7 @@
         <w:pStyle w:val="ListBullet"/>
       </w:pPr>
       <w:r>
-        <w:t>`python scouting_app/generate_data.py --num-players 20000 --db-url sqlite:///players_training.db --seed 42`</w:t>
+        <w:t>`python scouting_app/generate_data.py --num-players 20000 --db-url sqlite:///players_training.db --seed 42 --min-age 12 --max-age 18 --reset`</w:t>
       </w:r>
     </w:p>
     <w:p>
@@ -841,7 +945,7 @@
         <w:pStyle w:val="ListBullet"/>
       </w:pPr>
       <w:r>
-        <w:t>`python scouting_app/train_model.py --db-url sqlite:///players_training.db --model-out scouting_app/model.pt --preprocessor-out scouting_app/preprocessor.joblib --metadata-out scouting_app/training_metadata.json --epochs 30 --lr 1e-3 --patience 8`</w:t>
+        <w:t>`python scouting_app/train_model.py --db-url sqlite:///players_training.db --model-out scouting_app/model.pt --preprocessor-out scouting_app/preprocessor.joblib --calibrator-out scouting_app/probability_calibrator.joblib --metadata-out scouting_app/training_metadata.json --epochs 45 --lr 5e-4 --patience 10`</w:t>
       </w:r>
     </w:p>
     <w:p>

</xml_diff>

<commit_message>
feat: strengthen temporal training with residual pytorch bootstrap
</commit_message>
<xml_diff>
--- a/docs/model_training_evidence.docx
+++ b/docs/model_training_evidence.docx
@@ -178,7 +178,7 @@
         <w:pStyle w:val="ListBullet"/>
       </w:pPr>
       <w:r>
-        <w:t>Se agrego muestreo balanceado por mini-batch con `WeightedRandomSampler`.</w:t>
+        <w:t>El entrenamiento paso a usar `shuffle` por defecto y deja `WeightedRandomSampler` como opcion, evitando el doble rebalanceo por defecto.</w:t>
       </w:r>
     </w:p>
     <w:p>
@@ -218,6 +218,14 @@
         <w:pStyle w:val="ListBullet"/>
       </w:pPr>
       <w:r>
+        <w:t>`PlayerNet` ya no es una MLP plana: ahora arranca desde la solucion de `LogisticRegression(class_weight="balanced")` y aprende una correccion residual no lineal encima.</w:t>
+      </w:r>
+    </w:p>
+    <w:p>
+      <w:pPr>
+        <w:pStyle w:val="ListBullet"/>
+      </w:pPr>
+      <w:r>
         <w:t>El entrenamiento ahora se alinea por defecto al alcance real del MVP: edades 12-18.</w:t>
       </w:r>
     </w:p>
@@ -427,6 +435,54 @@
       </w:pPr>
       <w:r>
         <w:t>ultima proyeccion observada por scout</w:t>
+      </w:r>
+    </w:p>
+    <w:p>
+      <w:pPr>
+        <w:pStyle w:val="ListBullet"/>
+      </w:pPr>
+      <w:r>
+        <w:t>Se agregaron `PhysicalAssessment` y `PlayerAvailability` al esquema sintetico.</w:t>
+      </w:r>
+    </w:p>
+    <w:p>
+      <w:pPr>
+        <w:pStyle w:val="ListBullet"/>
+      </w:pPr>
+      <w:r>
+        <w:t>El pipeline ahora incorpora senales de:</w:t>
+      </w:r>
+    </w:p>
+    <w:p>
+      <w:pPr>
+        <w:pStyle w:val="ListBullet"/>
+      </w:pPr>
+      <w:r>
+        <w:t>altura y peso recientes</w:t>
+      </w:r>
+    </w:p>
+    <w:p>
+      <w:pPr>
+        <w:pStyle w:val="ListBullet"/>
+      </w:pPr>
+      <w:r>
+        <w:t>crecimiento corporal</w:t>
+      </w:r>
+    </w:p>
+    <w:p>
+      <w:pPr>
+        <w:pStyle w:val="ListBullet"/>
+      </w:pPr>
+      <w:r>
+        <w:t>velocidad y resistencia estimadas</w:t>
+      </w:r>
+    </w:p>
+    <w:p>
+      <w:pPr>
+        <w:pStyle w:val="ListBullet"/>
+      </w:pPr>
+      <w:r>
+        <w:t>disponibilidad, fatiga, carga de trabajo y tasa de lesion</w:t>
       </w:r>
     </w:p>
     <w:p>
@@ -499,7 +555,7 @@
         <w:pStyle w:val="ListBullet"/>
       </w:pPr>
       <w:r>
-        <w:t>Fecha de corrida registrada: `2026-04-18T03:05:47.143763`</w:t>
+        <w:t>Fecha de corrida registrada: `2026-04-22T00:48:09.395350`</w:t>
       </w:r>
     </w:p>
     <w:p>
@@ -515,7 +571,7 @@
         <w:pStyle w:val="ListBullet"/>
       </w:pPr>
       <w:r>
-        <w:t>Distribucion actual de clases: 599 positivos y 19401 negativos.</w:t>
+        <w:t>Distribucion actual de clases: 338 positivos y 19662 negativos.</w:t>
       </w:r>
     </w:p>
     <w:p>
@@ -523,7 +579,7 @@
         <w:pStyle w:val="ListBullet"/>
       </w:pPr>
       <w:r>
-        <w:t>Tasa positiva actual: 3.00%.</w:t>
+        <w:t>Tasa positiva actual: 1.69%.</w:t>
       </w:r>
     </w:p>
     <w:p>
@@ -539,7 +595,7 @@
         <w:pStyle w:val="ListBullet"/>
       </w:pPr>
       <w:r>
-        <w:t>`pos_weight` utilizado: 5.6932.</w:t>
+        <w:t>`pos_weight` utilizado: 58.3220.</w:t>
       </w:r>
     </w:p>
     <w:p>
@@ -547,7 +603,15 @@
         <w:pStyle w:val="ListBullet"/>
       </w:pPr>
       <w:r>
-        <w:t>Early stopping: mejor epoca 1 y threshold elegido 0.175.</w:t>
+        <w:t>Estrategia de desbalance activa: `pos_weight_strategy=full_ratio` y `sampler_strategy=shuffle`.</w:t>
+      </w:r>
+    </w:p>
+    <w:p>
+      <w:pPr>
+        <w:pStyle w:val="ListBullet"/>
+      </w:pPr>
+      <w:r>
+        <w:t>Early stopping: mejor epoca 3 y threshold elegido 0.150.</w:t>
       </w:r>
     </w:p>
     <w:p>
@@ -563,7 +627,7 @@
         <w:pStyle w:val="ListBullet"/>
       </w:pPr>
       <w:r>
-        <w:t>Threshold de progresion del target: 0.4051.</w:t>
+        <w:t>Threshold de progresion del target: 0.3700.</w:t>
       </w:r>
     </w:p>
     <w:p>
@@ -571,7 +635,7 @@
         <w:pStyle w:val="ListBullet"/>
       </w:pPr>
       <w:r>
-        <w:t>Threshold de rendimiento futuro del target: 5.2500.</w:t>
+        <w:t>Threshold de rendimiento futuro del target: 4.6600.</w:t>
       </w:r>
     </w:p>
     <w:p>
@@ -579,7 +643,7 @@
         <w:pStyle w:val="ListBullet"/>
       </w:pPr>
       <w:r>
-        <w:t>Casos positivos por via de consolidacion: 542.</w:t>
+        <w:t>Casos positivos por via de consolidacion: 310.</w:t>
       </w:r>
     </w:p>
     <w:p>
@@ -587,7 +651,7 @@
         <w:pStyle w:val="ListBullet"/>
       </w:pPr>
       <w:r>
-        <w:t>Casos positivos por via de breakout: 66.</w:t>
+        <w:t>Casos positivos por via de breakout: 28.</w:t>
       </w:r>
     </w:p>
     <w:p/>
@@ -604,7 +668,7 @@
         <w:pStyle w:val="ListBullet"/>
       </w:pPr>
       <w:r>
-        <w:t>Validacion: accuracy 0.9570, ROC-AUC 0.9543, PR-AUC 0.3558, F1 0.4317, precision 0.3577, recall 0.5444.</w:t>
+        <w:t>Validacion: accuracy 0.9710, ROC-AUC 0.9485, PR-AUC 0.2305, F1 0.3040, precision 0.2568, recall 0.3725.</w:t>
       </w:r>
     </w:p>
     <w:p>
@@ -612,7 +676,7 @@
         <w:pStyle w:val="ListBullet"/>
       </w:pPr>
       <w:r>
-        <w:t>Test: accuracy 0.9600, ROC-AUC 0.9247, PR-AUC 0.3279, F1 0.4231, precision 0.3729, recall 0.4889.</w:t>
+        <w:t>Test: accuracy 0.9713, ROC-AUC 0.9306, PR-AUC 0.2371, F1 0.3768, precision 0.2989, recall 0.5098.</w:t>
       </w:r>
     </w:p>
     <w:p>
@@ -620,7 +684,7 @@
         <w:pStyle w:val="ListBullet"/>
       </w:pPr>
       <w:r>
-        <w:t>Matriz de confusion PyTorch en test: [[2836, 74], [46, 44]].</w:t>
+        <w:t>Matriz de confusion PyTorch en test: [[2888, 61], [25, 26]].</w:t>
       </w:r>
     </w:p>
     <w:p/>
@@ -637,7 +701,7 @@
         <w:pStyle w:val="ListBullet"/>
       </w:pPr>
       <w:r>
-        <w:t>`LogisticRegression(class_weight="balanced")`: accuracy 0.9527, ROC-AUC 0.9431, PR-AUC 0.3923, F1 0.4409, precision 0.3415, recall 0.6222.</w:t>
+        <w:t>`LogisticRegression(class_weight="balanced")`: accuracy 0.9653, ROC-AUC 0.9425, PR-AUC 0.2775, F1 0.3659, precision 0.2655, recall 0.5882.</w:t>
       </w:r>
     </w:p>
     <w:p>
@@ -645,7 +709,7 @@
         <w:pStyle w:val="ListBullet"/>
       </w:pPr>
       <w:r>
-        <w:t>Baseline simple por promedio de atributos: accuracy 0.9547, ROC-AUC 0.9137, PR-AUC 0.2876, F1 0.3061.</w:t>
+        <w:t>Baseline simple por promedio de atributos: accuracy 0.9690, ROC-AUC 0.9004, PR-AUC 0.1993, F1 0.2560.</w:t>
       </w:r>
     </w:p>
     <w:p/>
@@ -670,7 +734,7 @@
         <w:pStyle w:val="ListBullet"/>
       </w:pPr>
       <w:r>
-        <w:t>La MLP actual ya no colapsa a todo negativo: paso de F1 0.0000 a F1 0.4231 y de PR-AUC 0.0915 a PR-AUC 0.3279.</w:t>
+        <w:t>La MLP actual ya no colapsa a todo negativo: paso de F1 0.0000 a F1 0.3768 y de PR-AUC 0.0915 a PR-AUC 0.2371.</w:t>
       </w:r>
     </w:p>
     <w:p>
@@ -694,6 +758,14 @@
         <w:pStyle w:val="ListBullet"/>
       </w:pPr>
       <w:r>
+        <w:t>El entrenamiento ahora tambien incorpora maduracion fisica y disponibilidad longitudinal.</w:t>
+      </w:r>
+    </w:p>
+    <w:p>
+      <w:pPr>
+        <w:pStyle w:val="ListBullet"/>
+      </w:pPr>
+      <w:r>
         <w:t>El problema de entrenamiento ahora es metodologicamente mas realista porque el target representa progresion futura y no un booleano estatico sintetico.</w:t>
       </w:r>
     </w:p>
@@ -718,7 +790,7 @@
         <w:pStyle w:val="ListBullet"/>
       </w:pPr>
       <w:r>
-        <w:t>El cambio de target mantiene un problema exigente y todavia desbalanceado: la tasa positiva actual es 3.00%.</w:t>
+        <w:t>El cambio de target mantiene un problema exigente y todavia desbalanceado: la tasa positiva actual es 1.69%.</w:t>
       </w:r>
     </w:p>
     <w:p>
@@ -734,7 +806,15 @@
         <w:pStyle w:val="ListBullet"/>
       </w:pPr>
       <w:r>
-        <w:t>Aun asi, el baseline `LogisticRegression(class_weight="balanced")` sigue superando a la MLP en ROC-AUC, PR-AUC y F1.</w:t>
+        <w:t>PyTorch ahora supera al baseline `LogisticRegression(class_weight="balanced")` en `F1` y precision al threshold operativo seleccionado.</w:t>
+      </w:r>
+    </w:p>
+    <w:p>
+      <w:pPr>
+        <w:pStyle w:val="ListBullet"/>
+      </w:pPr>
+      <w:r>
+        <w:t>El baseline `LogisticRegression(class_weight="balanced")` sigue superando a PyTorch en `ROC-AUC` y `PR-AUC`.</w:t>
       </w:r>
     </w:p>
     <w:p>
@@ -750,7 +830,7 @@
         <w:pStyle w:val="ListBullet"/>
       </w:pPr>
       <w:r>
-        <w:t>La senal del dataset existe, pero la red PyTorch todavia no demuestra una ventaja clara sobre el baseline lineal balanceado.</w:t>
+        <w:t>La senal del dataset existe y la arquitectura residual acorta la brecha, pero PyTorch todavia no demuestra una ventaja global clara sobre el baseline lineal balanceado.</w:t>
       </w:r>
     </w:p>
     <w:p/>
@@ -791,7 +871,15 @@
         <w:pStyle w:val="ListBullet"/>
       </w:pPr>
       <w:r>
-        <w:t>La calibracion de probabilidades existe, pero por ahora no alcanza para que PyTorch supere al baseline lineal.</w:t>
+        <w:t>La calibracion de probabilidades existe, pero por ahora no alcanza para que PyTorch gane tambien en `PR-AUC`.</w:t>
+      </w:r>
+    </w:p>
+    <w:p>
+      <w:pPr>
+        <w:pStyle w:val="ListBullet"/>
+      </w:pPr>
+      <w:r>
+        <w:t>La nueva senal de disponibilidad y fisico mejora la riqueza del problema, y la arquitectura residual si mejora el comportamiento operativo, pero no cambia aun el orden global por ranking.</w:t>
       </w:r>
     </w:p>
     <w:p>
@@ -807,7 +895,7 @@
         <w:pStyle w:val="ListBullet"/>
       </w:pPr>
       <w:r>
-        <w:t>La MLP mejoro, pero todavia no justifica por rendimiento reemplazar al baseline lineal como referencia formal.</w:t>
+        <w:t>La arquitectura residual mejora, pero todavia no justifica por rendimiento global reemplazar al baseline lineal como referencia formal.</w:t>
       </w:r>
     </w:p>
     <w:p/>

</xml_diff>

<commit_message>
docs: refresh MVP handoff and training evidence
</commit_message>
<xml_diff>
--- a/docs/model_training_evidence.docx
+++ b/docs/model_training_evidence.docx
@@ -24,7 +24,23 @@
         <w:pStyle w:val="ListBullet"/>
       </w:pPr>
       <w:r>
-        <w:t>Rama analizada: `training`</w:t>
+        <w:t>Rama analizada: `reformas-finales`</w:t>
+      </w:r>
+    </w:p>
+    <w:p>
+      <w:pPr>
+        <w:pStyle w:val="ListBullet"/>
+      </w:pPr>
+      <w:r>
+        <w:t>Rama estable cerrada del MVP corregido: `training`.</w:t>
+      </w:r>
+    </w:p>
+    <w:p>
+      <w:pPr>
+        <w:pStyle w:val="ListBullet"/>
+      </w:pPr>
+      <w:r>
+        <w:t>Rama activa para nuevas reformas: `reformas-finales`.</w:t>
       </w:r>
     </w:p>
     <w:p>
@@ -555,7 +571,7 @@
         <w:pStyle w:val="ListBullet"/>
       </w:pPr>
       <w:r>
-        <w:t>Fecha de corrida registrada: `2026-04-22T00:48:09.395350`</w:t>
+        <w:t>Fecha de corrida registrada: `2026-04-26T22:35:36.149703`</w:t>
       </w:r>
     </w:p>
     <w:p>
@@ -571,7 +587,7 @@
         <w:pStyle w:val="ListBullet"/>
       </w:pPr>
       <w:r>
-        <w:t>Distribucion actual de clases: 338 positivos y 19662 negativos.</w:t>
+        <w:t>Distribucion actual de clases: 1597 positivos y 18403 negativos.</w:t>
       </w:r>
     </w:p>
     <w:p>
@@ -579,7 +595,7 @@
         <w:pStyle w:val="ListBullet"/>
       </w:pPr>
       <w:r>
-        <w:t>Tasa positiva actual: 1.69%.</w:t>
+        <w:t>Tasa positiva actual: 7.99%.</w:t>
       </w:r>
     </w:p>
     <w:p>
@@ -595,7 +611,7 @@
         <w:pStyle w:val="ListBullet"/>
       </w:pPr>
       <w:r>
-        <w:t>`pos_weight` utilizado: 58.3220.</w:t>
+        <w:t>`pos_weight` utilizado: 11.5224.</w:t>
       </w:r>
     </w:p>
     <w:p>
@@ -611,7 +627,7 @@
         <w:pStyle w:val="ListBullet"/>
       </w:pPr>
       <w:r>
-        <w:t>Early stopping: mejor epoca 3 y threshold elegido 0.150.</w:t>
+        <w:t>Early stopping: mejor epoca 5 y threshold elegido 0.225.</w:t>
       </w:r>
     </w:p>
     <w:p>
@@ -627,7 +643,7 @@
         <w:pStyle w:val="ListBullet"/>
       </w:pPr>
       <w:r>
-        <w:t>Threshold de progresion del target: 0.3700.</w:t>
+        <w:t>Decision operativa del MVP: usar la salida cruda de PyTorch como score principal de ranking y conservar la calibrada como referencia secundaria.</w:t>
       </w:r>
     </w:p>
     <w:p>
@@ -635,7 +651,7 @@
         <w:pStyle w:val="ListBullet"/>
       </w:pPr>
       <w:r>
-        <w:t>Threshold de rendimiento futuro del target: 4.6600.</w:t>
+        <w:t>Threshold de progresion del target: 0.3013.</w:t>
       </w:r>
     </w:p>
     <w:p>
@@ -643,7 +659,7 @@
         <w:pStyle w:val="ListBullet"/>
       </w:pPr>
       <w:r>
-        <w:t>Casos positivos por via de consolidacion: 310.</w:t>
+        <w:t>Threshold de rendimiento futuro del target: 6.1929.</w:t>
       </w:r>
     </w:p>
     <w:p>
@@ -651,7 +667,15 @@
         <w:pStyle w:val="ListBullet"/>
       </w:pPr>
       <w:r>
-        <w:t>Casos positivos por via de breakout: 28.</w:t>
+        <w:t>Casos positivos por via de consolidacion: 1333.</w:t>
+      </w:r>
+    </w:p>
+    <w:p>
+      <w:pPr>
+        <w:pStyle w:val="ListBullet"/>
+      </w:pPr>
+      <w:r>
+        <w:t>Casos positivos por via de breakout: 264.</w:t>
       </w:r>
     </w:p>
     <w:p/>
@@ -668,7 +692,7 @@
         <w:pStyle w:val="ListBullet"/>
       </w:pPr>
       <w:r>
-        <w:t>Validacion: accuracy 0.9710, ROC-AUC 0.9485, PR-AUC 0.2305, F1 0.3040, precision 0.2568, recall 0.3725.</w:t>
+        <w:t>PyTorch crudo en validacion: accuracy 0.9110, ROC-AUC 0.9238, PR-AUC 0.5688, F1 0.5420, precision 0.4593, recall 0.6611.</w:t>
       </w:r>
     </w:p>
     <w:p>
@@ -676,7 +700,7 @@
         <w:pStyle w:val="ListBullet"/>
       </w:pPr>
       <w:r>
-        <w:t>Test: accuracy 0.9713, ROC-AUC 0.9306, PR-AUC 0.2371, F1 0.3768, precision 0.2989, recall 0.5098.</w:t>
+        <w:t>PyTorch crudo en test: accuracy 0.9073, ROC-AUC 0.9102, PR-AUC 0.4826, F1 0.5088, precision 0.4417, recall 0.6000.</w:t>
       </w:r>
     </w:p>
     <w:p>
@@ -684,7 +708,15 @@
         <w:pStyle w:val="ListBullet"/>
       </w:pPr>
       <w:r>
-        <w:t>Matriz de confusion PyTorch en test: [[2888, 61], [25, 26]].</w:t>
+        <w:t>PyTorch calibrado en test: accuracy 0.9057, ROC-AUC 0.9084, PR-AUC 0.4617, F1 0.5162, precision 0.4377, recall 0.6292.</w:t>
+      </w:r>
+    </w:p>
+    <w:p>
+      <w:pPr>
+        <w:pStyle w:val="ListBullet"/>
+      </w:pPr>
+      <w:r>
+        <w:t>Matriz de confusion PyTorch crudo en test: [[2578, 182], [96, 144]].</w:t>
       </w:r>
     </w:p>
     <w:p/>
@@ -701,7 +733,7 @@
         <w:pStyle w:val="ListBullet"/>
       </w:pPr>
       <w:r>
-        <w:t>`LogisticRegression(class_weight="balanced")`: accuracy 0.9653, ROC-AUC 0.9425, PR-AUC 0.2775, F1 0.3659, precision 0.2655, recall 0.5882.</w:t>
+        <w:t>`LogisticRegression(class_weight="balanced")`: accuracy 0.9110, ROC-AUC 0.9086, PR-AUC 0.4728, F1 0.4875, precision 0.4520, recall 0.5292.</w:t>
       </w:r>
     </w:p>
     <w:p>
@@ -709,7 +741,7 @@
         <w:pStyle w:val="ListBullet"/>
       </w:pPr>
       <w:r>
-        <w:t>Baseline simple por promedio de atributos: accuracy 0.9690, ROC-AUC 0.9004, PR-AUC 0.1993, F1 0.2560.</w:t>
+        <w:t>Baseline simple por promedio de atributos: accuracy 0.8887, ROC-AUC 0.8298, PR-AUC 0.3298, F1 0.3792.</w:t>
       </w:r>
     </w:p>
     <w:p/>
@@ -734,7 +766,7 @@
         <w:pStyle w:val="ListBullet"/>
       </w:pPr>
       <w:r>
-        <w:t>La MLP actual ya no colapsa a todo negativo: paso de F1 0.0000 a F1 0.3768 y de PR-AUC 0.0915 a PR-AUC 0.2371.</w:t>
+        <w:t>La MLP actual ya no colapsa a todo negativo: paso de F1 0.0000 a F1 0.5088 y de PR-AUC 0.0915 a PR-AUC 0.4826.</w:t>
       </w:r>
     </w:p>
     <w:p>
@@ -790,7 +822,7 @@
         <w:pStyle w:val="ListBullet"/>
       </w:pPr>
       <w:r>
-        <w:t>El cambio de target mantiene un problema exigente y todavia desbalanceado: la tasa positiva actual es 1.69%.</w:t>
+        <w:t>El cambio de target mantiene un problema exigente y todavia desbalanceado: la tasa positiva actual es 7.99%.</w:t>
       </w:r>
     </w:p>
     <w:p>
@@ -806,7 +838,7 @@
         <w:pStyle w:val="ListBullet"/>
       </w:pPr>
       <w:r>
-        <w:t>PyTorch ahora supera al baseline `LogisticRegression(class_weight="balanced")` en `F1` y precision al threshold operativo seleccionado.</w:t>
+        <w:t>PyTorch crudo ahora supera al baseline `LogisticRegression(class_weight="balanced")` en `PR-AUC` y `F1` en la corrida oficial actual.</w:t>
       </w:r>
     </w:p>
     <w:p>
@@ -814,7 +846,7 @@
         <w:pStyle w:val="ListBullet"/>
       </w:pPr>
       <w:r>
-        <w:t>El baseline `LogisticRegression(class_weight="balanced")` sigue superando a PyTorch en `ROC-AUC` y `PR-AUC`.</w:t>
+        <w:t>La salida calibrada mejora levemente `F1` y `recall`, pero baja `PR-AUC`; por eso queda como evidencia secundaria, no como score principal del MVP.</w:t>
       </w:r>
     </w:p>
     <w:p>
@@ -830,7 +862,7 @@
         <w:pStyle w:val="ListBullet"/>
       </w:pPr>
       <w:r>
-        <w:t>La senal del dataset existe y la arquitectura residual acorta la brecha, pero PyTorch todavia no demuestra una ventaja global clara sobre el baseline lineal balanceado.</w:t>
+        <w:t>La senal del dataset existe y la arquitectura residual acorta la brecha; aun asi, la decision debe seguir revisandose si cambian datos o target.</w:t>
       </w:r>
     </w:p>
     <w:p/>
@@ -871,7 +903,7 @@
         <w:pStyle w:val="ListBullet"/>
       </w:pPr>
       <w:r>
-        <w:t>La calibracion de probabilidades existe, pero por ahora no alcanza para que PyTorch gane tambien en `PR-AUC`.</w:t>
+        <w:t>La calibracion de probabilidades existe, pero por ahora se mantiene como referencia secundaria porque reduce `PR-AUC` frente a la salida cruda.</w:t>
       </w:r>
     </w:p>
     <w:p>
@@ -879,7 +911,7 @@
         <w:pStyle w:val="ListBullet"/>
       </w:pPr>
       <w:r>
-        <w:t>La nueva senal de disponibilidad y fisico mejora la riqueza del problema, y la arquitectura residual si mejora el comportamiento operativo, pero no cambia aun el orden global por ranking.</w:t>
+        <w:t>La nueva senal de disponibilidad y fisico mejora la riqueza del problema, y la arquitectura residual mejora el ranking en la corrida oficial actual.</w:t>
       </w:r>
     </w:p>
     <w:p>
@@ -895,7 +927,7 @@
         <w:pStyle w:val="ListBullet"/>
       </w:pPr>
       <w:r>
-        <w:t>La arquitectura residual mejora, pero todavia no justifica por rendimiento global reemplazar al baseline lineal como referencia formal.</w:t>
+        <w:t>El baseline lineal sigue siendo referencia formal obligatoria aunque PyTorch crudo sea el score principal actual.</w:t>
       </w:r>
     </w:p>
     <w:p/>
@@ -912,7 +944,7 @@
         <w:pStyle w:val="ListBullet"/>
       </w:pPr>
       <w:r>
-        <w:t>`pytest -q`: 35 tests aprobados.</w:t>
+        <w:t>`pytest -q`: 40 tests aprobados.</w:t>
       </w:r>
     </w:p>
     <w:p>
@@ -1033,7 +1065,23 @@
         <w:pStyle w:val="ListBullet"/>
       </w:pPr>
       <w:r>
-        <w:t>`python scouting_app/train_model.py --db-url sqlite:///players_training.db --model-out scouting_app/model.pt --preprocessor-out scouting_app/preprocessor.joblib --calibrator-out scouting_app/probability_calibrator.joblib --metadata-out scouting_app/training_metadata.json --epochs 45 --lr 5e-4 --patience 10`</w:t>
+        <w:t>`python scouting_app/train_model.py --db-url sqlite:///players_training.db --model-out scouting_app/model.pt --preprocessor-out scouting_app/preprocessor.joblib --calibrator-out scouting_app/probability_calibrator.joblib --metadata-out scouting_app/training_metadata.json --splits-out scouting_app/training_splits.json --epochs 45 --lr 5e-4 --patience 10`</w:t>
+      </w:r>
+    </w:p>
+    <w:p>
+      <w:pPr>
+        <w:pStyle w:val="ListBullet"/>
+      </w:pPr>
+      <w:r>
+        <w:t>Evaluar artefactos:</w:t>
+      </w:r>
+    </w:p>
+    <w:p>
+      <w:pPr>
+        <w:pStyle w:val="ListBullet"/>
+      </w:pPr>
+      <w:r>
+        <w:t>`python scouting_app/evaluate_saved_model.py --db-url sqlite:///players_training.db --metadata-path scouting_app/training_metadata.json`</w:t>
       </w:r>
     </w:p>
     <w:p>

</xml_diff>